<commit_message>
代码结构整理：分 experiments/ · evidence/ · reference/ 三个子目录
原来 13 个 .py 平铺在 data-Project1/ 下，主实验脚本和"为回答某一个小问题才写"
的补充脚本混在一起，助教原件和数据也混在 16 个条目里。按用途分三类：

  main.py  plots.py            ← 主实验（只看这两个就能读懂全实验）
  experiments/                 ← 8 个补充实验，每个回答一个具体问题
  evidence/                    ← 2 个证据生成脚本（过程性演示 + 终端截图）
  reference/                   ← 助教原件 draft_main.py、TUNING.md
  train_data.csv  predictions.csv

实现要点：
- 9 个跨目录脚本在文件头插入 3 行 sys.path 垫片，使其仍能 import main；
  main.py 里的 RESULT_DIR / FIG_DIR 以它自身位置为锚，搬家不影响输出路径。
- make_term_shots.py 的 LAB 锚点由 HERE.parent 改为 HERE.parent.parent。
- nb_alpha_check.py 原本是扁平脚本（顶层代码直接执行、无 __main__ 保护），
  已重构为 main_cli() + __main__，与其余脚本一致。
- 顺带修 mlp_tune.py 文件头里过时的说明（仍写着"只跑了 6 组就停了"）。

验证：11 个模块全部能正常加载（importlib 执行模块体，0 失败）；
文档里的 32 处脚本路径全部加上子目录前缀；6 份 README 的目录树与文件表同步。

Co-Authored-By: Claude Opus 4.8 <noreply@anthropic.com>
</commit_message>
<xml_diff>
--- a/当代人工智能Lab1.docx
+++ b/当代人工智能Lab1.docx
@@ -1671,21 +1671,7 @@
           <w:szCs w:val="22"/>
           <w:lang w:val="en-US" w:eastAsia="zh-CN"/>
         </w:rPr>
-        <w:t>采用Pipeline封装 TF-IDF 与分类器，数据集划分优先于特征拟合：TF-IDF 仅使用训练集拟合；数据增强仅作用于训练样本，测试集文件做隔离，读取前进行SH</w:t>
-      </w:r>
-      <w:bookmarkStart w:id="0" w:name="_GoBack"/>
-      <w:bookmarkEnd w:id="0"/>
-      <w:r>
-        <w:rPr>
-          <w:rFonts w:hint="eastAsia" w:ascii="微软雅黑 Light" w:hAnsi="微软雅黑 Light" w:eastAsia="微软雅黑 Light" w:cs="微软雅黑 Light"/>
-          <w:i w:val="0"/>
-          <w:iCs w:val="0"/>
-          <w:color w:val="auto"/>
-          <w:sz w:val="20"/>
-          <w:szCs w:val="22"/>
-          <w:lang w:val="en-US" w:eastAsia="zh-CN"/>
-        </w:rPr>
-        <w:t>A256指纹字节校验，运行日志记录对应数据指纹，可自证测试集未使用。</w:t>
+        <w:t>采用Pipeline封装 TF-IDF 与分类器，数据集划分优先于特征拟合：TF-IDF 仅使用训练集拟合；数据增强仅作用于训练样本，测试集文件做隔离，读取前进行SHA256指纹字节校验，运行日志记录对应数据指纹，可自证测试集未使用。</w:t>
       </w:r>
     </w:p>
     <w:p>
@@ -9807,10 +9793,6 @@
             <w:insideH w:val="single" w:color="auto" w:sz="4" w:space="0"/>
             <w:insideV w:val="single" w:color="auto" w:sz="4" w:space="0"/>
           </w:tblBorders>
-          <w:tblCellMar>
-            <w:left w:w="108" w:type="dxa"/>
-            <w:right w:w="108" w:type="dxa"/>
-          </w:tblCellMar>
         </w:tblPrEx>
         <w:tc>
           <w:tcPr>
@@ -10702,6 +10684,10 @@
             <w:insideH w:val="single" w:color="auto" w:sz="4" w:space="0"/>
             <w:insideV w:val="single" w:color="auto" w:sz="4" w:space="0"/>
           </w:tblBorders>
+          <w:tblCellMar>
+            <w:left w:w="108" w:type="dxa"/>
+            <w:right w:w="108" w:type="dxa"/>
+          </w:tblCellMar>
         </w:tblPrEx>
         <w:tc>
           <w:tcPr>
@@ -11601,6 +11587,10 @@
             <w:insideH w:val="single" w:color="auto" w:sz="4" w:space="0"/>
             <w:insideV w:val="single" w:color="auto" w:sz="4" w:space="0"/>
           </w:tblBorders>
+          <w:tblCellMar>
+            <w:left w:w="108" w:type="dxa"/>
+            <w:right w:w="108" w:type="dxa"/>
+          </w:tblCellMar>
         </w:tblPrEx>
         <w:tc>
           <w:tcPr>
@@ -11898,6 +11888,10 @@
             <w:insideH w:val="single" w:color="auto" w:sz="4" w:space="0"/>
             <w:insideV w:val="single" w:color="auto" w:sz="4" w:space="0"/>
           </w:tblBorders>
+          <w:tblCellMar>
+            <w:left w:w="108" w:type="dxa"/>
+            <w:right w:w="108" w:type="dxa"/>
+          </w:tblCellMar>
         </w:tblPrEx>
         <w:tc>
           <w:tcPr>
@@ -13275,10 +13269,6 @@
             <w:insideH w:val="single" w:color="auto" w:sz="4" w:space="0"/>
             <w:insideV w:val="single" w:color="auto" w:sz="4" w:space="0"/>
           </w:tblBorders>
-          <w:tblCellMar>
-            <w:left w:w="108" w:type="dxa"/>
-            <w:right w:w="108" w:type="dxa"/>
-          </w:tblCellMar>
         </w:tblPrEx>
         <w:tc>
           <w:tcPr>
@@ -13858,6 +13848,10 @@
             <w:insideH w:val="single" w:color="auto" w:sz="4" w:space="0"/>
             <w:insideV w:val="single" w:color="auto" w:sz="4" w:space="0"/>
           </w:tblBorders>
+          <w:tblCellMar>
+            <w:left w:w="108" w:type="dxa"/>
+            <w:right w:w="108" w:type="dxa"/>
+          </w:tblCellMar>
         </w:tblPrEx>
         <w:trPr>
           <w:trHeight w:val="273" w:hRule="atLeast"/>
@@ -15612,10 +15606,6 @@
             <w:insideH w:val="single" w:color="auto" w:sz="4" w:space="0"/>
             <w:insideV w:val="single" w:color="auto" w:sz="4" w:space="0"/>
           </w:tblBorders>
-          <w:tblCellMar>
-            <w:left w:w="108" w:type="dxa"/>
-            <w:right w:w="108" w:type="dxa"/>
-          </w:tblCellMar>
         </w:tblPrEx>
         <w:trPr>
           <w:trHeight w:val="208" w:hRule="atLeast"/>
@@ -16495,6 +16485,10 @@
             <w:insideH w:val="none" w:color="auto" w:sz="4" w:space="0"/>
             <w:insideV w:val="none" w:color="auto" w:sz="4" w:space="0"/>
           </w:tblBorders>
+          <w:tblCellMar>
+            <w:left w:w="108" w:type="dxa"/>
+            <w:right w:w="108" w:type="dxa"/>
+          </w:tblCellMar>
         </w:tblPrEx>
         <w:tc>
           <w:tcPr>
@@ -17793,7 +17787,24 @@
           <w:szCs w:val="22"/>
           <w:lang w:val="en-US" w:eastAsia="zh-CN" w:bidi="ar-SA"/>
         </w:rPr>
-        <w:t>·1.数据集含近重复样本2.类别标签为反推得到3.MLP调参搜索不完备4.结论迁移性未验证</w:t>
+        <w:t>·1.数据集含近重复样本2.类别标签为反推得到3.MLP调参需要时间太多没跑完</w:t>
+      </w:r>
+      <w:bookmarkStart w:id="0" w:name="_GoBack"/>
+      <w:bookmarkEnd w:id="0"/>
+      <w:r>
+        <w:rPr>
+          <w:rFonts w:hint="eastAsia" w:ascii="微软雅黑 Light" w:hAnsi="微软雅黑 Light" w:eastAsia="微软雅黑 Light" w:cs="微软雅黑 Light"/>
+          <w:b w:val="0"/>
+          <w:bCs w:val="0"/>
+          <w:i w:val="0"/>
+          <w:iCs w:val="0"/>
+          <w:color w:val="auto"/>
+          <w:kern w:val="2"/>
+          <w:sz w:val="20"/>
+          <w:szCs w:val="22"/>
+          <w:lang w:val="en-US" w:eastAsia="zh-CN" w:bidi="ar-SA"/>
+        </w:rPr>
+        <w:t>4.结论迁移性未验证</w:t>
       </w:r>
     </w:p>
     <w:sectPr>

</xml_diff>